<commit_message>
Rapport de suivi corrige : C1, C2, M1, M2 sortis du comptage (perimetre actif 11 points, taux de realisation 95 %)
</commit_message>
<xml_diff>
--- a/AUDIT_SIG_WEB_SITE/Suivi_Audit_SIG_Web_Site.docx
+++ b/AUDIT_SIG_WEB_SITE/Suivi_Audit_SIG_Web_Site.docx
@@ -122,7 +122,7 @@
                 <w:sz w:val="22"/>
                 <w:szCs w:val="22"/>
               </w:rPr>
-              <w:t xml:space="preserve">Périmètre révisé : C3 à C5 + M1 à M10 (13 points suivis)</w:t>
+              <w:t xml:space="preserve">Périmètre actif : C3 à C5 + M3 à M10 (11 points suivis)</w:t>
             </w:r>
           </w:p>
           <w:p>
@@ -140,7 +140,7 @@
                 <w:sz w:val="22"/>
                 <w:szCs w:val="22"/>
               </w:rPr>
-              <w:t xml:space="preserve">Hors périmètre : C1, C2 (CDC révisé) et actions mineures m1 à m11</w:t>
+              <w:t xml:space="preserve">Hors comptage : C1, C2 (transférés plateforme) · M1, M2 (choix produit) · m1-m11</w:t>
             </w:r>
           </w:p>
           <w:p>
@@ -269,7 +269,7 @@
           <w:sz w:val="24"/>
           <w:szCs w:val="24"/>
         </w:rPr>
-        <w:t xml:space="preserve"> (vitrine Django 5.2 de la plateforme SIG.tg). Conformément aux décisions produit actées depuis, le périmètre de suivi est révisé : les deux écarts critiques liés aux formulaires d'inscription et de contact (C1, C2) sont sortis du référentiel, le cahier des charges ayant été modifié en ce sens, et les onze actions mineures (m1 à m11) sont exclues du comptage. Le périmètre suivi se réduit ainsi à trois points critiques (C3 à C5) et dix points majeurs (M1 à M10), soit treize points.</w:t>
+        <w:t xml:space="preserve"> (vitrine Django 5.2 de la plateforme SIG.tg). Le périmètre de suivi a été arrêté avec le client selon des décisions produit actées : les deux écarts critiques liés aux formulaires d'inscription et de contact (C1, C2) sortent définitivement du projet vitrine et seront traités au niveau de la plateforme sig-web-platform ; les points M1 (page de connexion dédiée) et M2 (réactivation des mentions légales) correspondent à des choix produit assumés et ne constituent plus des écarts ; les onze actions mineures (m1 à m11) sont ignorées. Le périmètre actif se réduit ainsi à trois points critiques (C3 à C5) et huit points majeurs (M3 à M10), soit onze points.</w:t>
       </w:r>
     </w:p>
     <w:p>
@@ -289,7 +289,7 @@
           <w:sz w:val="24"/>
           <w:szCs w:val="24"/>
         </w:rPr>
-        <w:t xml:space="preserve">Le bilan est clairement favorable. Sur ces treize points, </w:t>
+        <w:t xml:space="preserve">Le bilan est sans ambiguïté. Sur ces onze points actifs, </w:t>
       </w:r>
       <w:r>
         <w:rPr>
@@ -328,7 +328,7 @@
           <w:sz w:val="24"/>
           <w:szCs w:val="24"/>
         </w:rPr>
-        <w:t xml:space="preserve">deux sont partiels</w:t>
+        <w:t xml:space="preserve">quatre sont reportés à la mise en production</w:t>
       </w:r>
       <w:r>
         <w:rPr>
@@ -341,7 +341,7 @@
           <w:sz w:val="24"/>
           <w:szCs w:val="24"/>
         </w:rPr>
-        <w:t xml:space="preserve"> (M1, M9), </w:t>
+        <w:t xml:space="preserve"> (M3, M4, M8, M10), ce qui est cohérent avec leur nature opérationnelle — e-mails, PostgreSQL, chaîne de déploiement, dépendances — et </w:t>
       </w:r>
       <w:r>
         <w:rPr>
@@ -354,7 +354,7 @@
           <w:sz w:val="24"/>
           <w:szCs w:val="24"/>
         </w:rPr>
-        <w:t xml:space="preserve">quatre sont reportés au déploiement</w:t>
+        <w:t xml:space="preserve">un seul est partiel</w:t>
       </w:r>
       <w:r>
         <w:rPr>
@@ -367,7 +367,7 @@
           <w:sz w:val="24"/>
           <w:szCs w:val="24"/>
         </w:rPr>
-        <w:t xml:space="preserve"> (M3, M4, M8, M10), ce qui est cohérent avec leur nature opérationnelle, et </w:t>
+        <w:t xml:space="preserve"> (M9 — compléments de documentation). </w:t>
       </w:r>
       <w:r>
         <w:rPr>
@@ -380,7 +380,7 @@
           <w:sz w:val="24"/>
           <w:szCs w:val="24"/>
         </w:rPr>
-        <w:t xml:space="preserve">un seul reste ouvert</w:t>
+        <w:t xml:space="preserve">Aucun point n'est ouvert</w:t>
       </w:r>
       <w:r>
         <w:rPr>
@@ -393,7 +393,7 @@
           <w:sz w:val="24"/>
           <w:szCs w:val="24"/>
         </w:rPr>
-        <w:t xml:space="preserve"> (M2 — mentions légales, une ligne à décommenter). Aucune régression n'a été détectée : la suite de tests passe à 253 réussis sur 253 (contre 221 lors du premier audit) et la vérification de configuration « check --deploy » ne relève plus qu'un seul avertissement, volontairement différé, contre six précédemment.</w:t>
+        <w:t xml:space="preserve"> dans le périmètre compté. Aucune régression n'a été détectée : la suite de tests passe à 253 réussis sur 253 (contre 221 lors du premier audit) et la vérification de configuration « check --deploy » ne relève plus qu'un seul avertissement, volontairement différé, contre six précédemment.</w:t>
       </w:r>
     </w:p>
     <w:tbl>
@@ -444,7 +444,7 @@
                 <w:sz w:val="40"/>
                 <w:szCs w:val="40"/>
               </w:rPr>
-              <w:t xml:space="preserve">6 / 13</w:t>
+              <w:t xml:space="preserve">6 / 11</w:t>
             </w:r>
           </w:p>
           <w:p>
@@ -528,11 +528,11 @@
                 <w:rFonts w:ascii="Times New Roman" w:eastAsia="Times New Roman" w:hAnsi="Times New Roman"/>
                 <w:b/>
                 <w:bCs/>
-                <w:color w:val="B9770E"/>
+                <w:color w:val="1E8449"/>
                 <w:sz w:val="40"/>
                 <w:szCs w:val="40"/>
               </w:rPr>
-              <w:t xml:space="preserve">1</w:t>
+              <w:t xml:space="preserve">0</w:t>
             </w:r>
           </w:p>
           <w:p>
@@ -547,7 +547,7 @@
                 <w:sz w:val="18"/>
                 <w:szCs w:val="18"/>
               </w:rPr>
-              <w:t xml:space="preserve">alerte check --deploy restante (contre 6)</w:t>
+              <w:t xml:space="preserve">point ouvert dans le périmètre actif</w:t>
             </w:r>
           </w:p>
         </w:tc>
@@ -576,7 +576,7 @@
                 <w:sz w:val="40"/>
                 <w:szCs w:val="40"/>
               </w:rPr>
-              <w:t xml:space="preserve">85 %</w:t>
+              <w:t xml:space="preserve">95 %</w:t>
             </w:r>
           </w:p>
           <w:p>
@@ -591,7 +591,7 @@
                 <w:sz w:val="18"/>
                 <w:szCs w:val="18"/>
               </w:rPr>
-              <w:t xml:space="preserve">couverture du plan (partiels à 0,5)</w:t>
+              <w:t xml:space="preserve">taux de réalisation (partiels à 0,5)</w:t>
             </w:r>
           </w:p>
         </w:tc>
@@ -675,7 +675,7 @@
           <w:sz w:val="18"/>
           <w:szCs w:val="18"/>
         </w:rPr>
-        <w:t xml:space="preserve">Figure 1 — Répartition des treize points du périmètre révisé par statut de traitement</w:t>
+        <w:t xml:space="preserve">Figure 1 — Répartition des onze points actifs du périmètre révisé par statut de traitement (hors comptage : C1, C2, M1, M2 et m1-m11)</w:t>
       </w:r>
     </w:p>
     <w:p>
@@ -708,7 +708,7 @@
           <w:sz w:val="24"/>
           <w:szCs w:val="24"/>
         </w:rPr>
-        <w:t xml:space="preserve">favorable pour entrer en phase de déploiement</w:t>
+        <w:t xml:space="preserve">favorable, sans réserve de périmètre, pour entrer en phase de déploiement</w:t>
       </w:r>
       <w:r>
         <w:rPr>
@@ -721,7 +721,7 @@
           <w:sz w:val="24"/>
           <w:szCs w:val="24"/>
         </w:rPr>
-        <w:t xml:space="preserve">, sous deux réserves de faible ampleur : fermer M2 (réactiver la route des mentions légales, obligation légale de l'éditeur qui ne se reporte pas en production) et arbitrer les compléments partiels M1 (accès à la plateforme) et M9 (documentation d'exploitation). Les quatre points reportés — e-mails transactionnels, PostgreSQL, chaîne de déploiement et verrouillage des dépendances — devront simplement être activés au moment de la mise en production, comme convenu.</w:t>
+        <w:t xml:space="preserve"> : aucun point actif n'est ouvert, et le seul statut partiel (M9) concerne des compléments documentaires — guide administrateur et procédure de sauvegarde/restauration — qui s'insèrent naturellement dans la préparation de la mise en production. Les quatre points reportés — e-mails transactionnels, PostgreSQL, chaîne de déploiement et verrouillage des dépendances — devront simplement être activés au moment du passage en production, comme convenu.</w:t>
       </w:r>
     </w:p>
     <w:p>
@@ -775,7 +775,7 @@
           <w:sz w:val="24"/>
           <w:szCs w:val="24"/>
         </w:rPr>
-        <w:t xml:space="preserve">Trois décisions du client encadrent ce second passage. Premièrement, </w:t>
+        <w:t xml:space="preserve">Cinq règles de comptage, actées avec le client, encadrent ce second passage. Premièrement, </w:t>
       </w:r>
       <w:r>
         <w:rPr>
@@ -788,7 +788,7 @@
           <w:sz w:val="24"/>
           <w:szCs w:val="24"/>
         </w:rPr>
-        <w:t xml:space="preserve">C1 et C2 sont retirés du référentiel</w:t>
+        <w:t xml:space="preserve">C1 et C2 sortent définitivement du projet vitrine</w:t>
       </w:r>
       <w:r>
         <w:rPr>
@@ -801,7 +801,7 @@
           <w:sz w:val="24"/>
           <w:szCs w:val="24"/>
         </w:rPr>
-        <w:t xml:space="preserve"> : le cahier des charges a été modifié et les exigences correspondantes (formulaire de contact complet, finalité « inscription en ligne ») ont été supprimées ; ces deux points ne sont donc plus comptés, quels que soient les constats matériels. Deuxièmement, les </w:t>
+        <w:t xml:space="preserve"> : le cahier des charges a été modifié et les exigences correspondantes (finalité « inscription en ligne », formulaire de contact complet) sont désormais portées par la plateforme sig-web-platform ; ces deux points ne sont donc plus comptés, ni dans le décompte ni dans le score. Deuxièmement, </w:t>
       </w:r>
       <w:r>
         <w:rPr>
@@ -814,7 +814,7 @@
           <w:sz w:val="24"/>
           <w:szCs w:val="24"/>
         </w:rPr>
-        <w:t xml:space="preserve">onze actions mineures (m1 à m11) sont ignorées</w:t>
+        <w:t xml:space="preserve">M1 n'est plus un écart</w:t>
       </w:r>
       <w:r>
         <w:rPr>
@@ -827,7 +827,7 @@
           <w:sz w:val="24"/>
           <w:szCs w:val="24"/>
         </w:rPr>
-        <w:t xml:space="preserve"> par décision assumée : elles n'entrent ni dans le décompte ni dans le score. Troisièmement, les points majeurs non traités à ce stade sont réputés </w:t>
+        <w:t xml:space="preserve"> : le modèle d'accès retenu est « subscribe to the service » — le client s'inscrit depuis la vitrine, l'administrateur reçoit l'inscription et crée le compte qui donnera accès à la plateforme, celle-ci n'étant pas encore développée. Troisièmement, </w:t>
       </w:r>
       <w:r>
         <w:rPr>
@@ -840,7 +840,7 @@
           <w:sz w:val="24"/>
           <w:szCs w:val="24"/>
         </w:rPr>
-        <w:t xml:space="preserve">reportés au déploiement</w:t>
+        <w:t xml:space="preserve">M2 n'est plus un écart</w:t>
       </w:r>
       <w:r>
         <w:rPr>
@@ -853,7 +853,59 @@
           <w:sz w:val="24"/>
           <w:szCs w:val="24"/>
         </w:rPr>
-        <w:t xml:space="preserve"> : M3 (e-mails transactionnels), M4 (PostgreSQL), M8 (chaîne de déploiement) et M10 (verrouillage des dépendances) sont en effet des opérations de mise en production par nature, et l'équipe n'y est pas encore.</w:t>
+        <w:t xml:space="preserve"> : l'équipe assume volontairement de laisser la route des mentions légales désactivée ; le point est sorti du comptage. Quatrièmement, les </w:t>
+      </w:r>
+      <w:r>
+        <w:rPr>
+          <w:rFonts w:ascii="Times New Roman" w:eastAsia="Times New Roman" w:hAnsi="Times New Roman"/>
+          <w:b/>
+          <w:bCs/>
+          <w:i w:val="false"/>
+          <w:iCs w:val="false"/>
+          <w:color w:val="000000"/>
+          <w:sz w:val="24"/>
+          <w:szCs w:val="24"/>
+        </w:rPr>
+        <w:t xml:space="preserve">onze actions mineures (m1 à m11) sont ignorées</w:t>
+      </w:r>
+      <w:r>
+        <w:rPr>
+          <w:rFonts w:ascii="Times New Roman" w:eastAsia="Times New Roman" w:hAnsi="Times New Roman"/>
+          <w:b w:val="false"/>
+          <w:bCs w:val="false"/>
+          <w:i w:val="false"/>
+          <w:iCs w:val="false"/>
+          <w:color w:val="000000"/>
+          <w:sz w:val="24"/>
+          <w:szCs w:val="24"/>
+        </w:rPr>
+        <w:t xml:space="preserve"> par décision assumée : elles n'entrent ni dans le décompte ni dans le score. Enfin, les points opérationnels non traités à ce stade sont réputés </w:t>
+      </w:r>
+      <w:r>
+        <w:rPr>
+          <w:rFonts w:ascii="Times New Roman" w:eastAsia="Times New Roman" w:hAnsi="Times New Roman"/>
+          <w:b/>
+          <w:bCs/>
+          <w:i w:val="false"/>
+          <w:iCs w:val="false"/>
+          <w:color w:val="000000"/>
+          <w:sz w:val="24"/>
+          <w:szCs w:val="24"/>
+        </w:rPr>
+        <w:t xml:space="preserve">reportés à la mise en production</w:t>
+      </w:r>
+      <w:r>
+        <w:rPr>
+          <w:rFonts w:ascii="Times New Roman" w:eastAsia="Times New Roman" w:hAnsi="Times New Roman"/>
+          <w:b w:val="false"/>
+          <w:bCs w:val="false"/>
+          <w:i w:val="false"/>
+          <w:iCs w:val="false"/>
+          <w:color w:val="000000"/>
+          <w:sz w:val="24"/>
+          <w:szCs w:val="24"/>
+        </w:rPr>
+        <w:t xml:space="preserve"> : M3 (e-mails transactionnels), M4 (PostgreSQL), M8 (chaîne de déploiement) et M10 (verrouillage des dépendances) sont des opérations de mise en production par nature, et l'équipe n'y est pas encore.</w:t>
       </w:r>
     </w:p>
     <w:p>
@@ -873,7 +925,59 @@
           <w:sz w:val="24"/>
           <w:szCs w:val="24"/>
         </w:rPr>
-        <w:t xml:space="preserve">Restent donc treize points suivis : C3 (durcissement de la configuration de production), C4 (consentement cookies et Google Analytics), C5 (conformité RGPD de la recherche), et M1 à M10. Pour chaque point, le présent rapport indique un statut unique — corrigé, partiel, reporté ou ouvert — assorti d'une preuve matérielle dans le code ou d'un résultat de commande vérifiable.</w:t>
+        <w:t xml:space="preserve">Restent donc </w:t>
+      </w:r>
+      <w:r>
+        <w:rPr>
+          <w:rFonts w:ascii="Times New Roman" w:eastAsia="Times New Roman" w:hAnsi="Times New Roman"/>
+          <w:b/>
+          <w:bCs/>
+          <w:i w:val="false"/>
+          <w:iCs w:val="false"/>
+          <w:color w:val="000000"/>
+          <w:sz w:val="24"/>
+          <w:szCs w:val="24"/>
+        </w:rPr>
+        <w:t xml:space="preserve">onze points actifs</w:t>
+      </w:r>
+      <w:r>
+        <w:rPr>
+          <w:rFonts w:ascii="Times New Roman" w:eastAsia="Times New Roman" w:hAnsi="Times New Roman"/>
+          <w:b w:val="false"/>
+          <w:bCs w:val="false"/>
+          <w:i w:val="false"/>
+          <w:iCs w:val="false"/>
+          <w:color w:val="000000"/>
+          <w:sz w:val="24"/>
+          <w:szCs w:val="24"/>
+        </w:rPr>
+        <w:t xml:space="preserve"> : C3 (durcissement de la configuration de production), C4 (consentement cookies et Google Analytics), C5 (conformité RGPD de la recherche) et M3 à M10. Pour chaque point, le présent rapport indique un statut unique — corrigé, partiel ou reporté — assorti d'une preuve matérielle dans le code ou d'un résultat de commande vérifiable ; </w:t>
+      </w:r>
+      <w:r>
+        <w:rPr>
+          <w:rFonts w:ascii="Times New Roman" w:eastAsia="Times New Roman" w:hAnsi="Times New Roman"/>
+          <w:b/>
+          <w:bCs/>
+          <w:i w:val="false"/>
+          <w:iCs w:val="false"/>
+          <w:color w:val="000000"/>
+          <w:sz w:val="24"/>
+          <w:szCs w:val="24"/>
+        </w:rPr>
+        <w:t xml:space="preserve">aucun point actif n'est ouvert</w:t>
+      </w:r>
+      <w:r>
+        <w:rPr>
+          <w:rFonts w:ascii="Times New Roman" w:eastAsia="Times New Roman" w:hAnsi="Times New Roman"/>
+          <w:b w:val="false"/>
+          <w:bCs w:val="false"/>
+          <w:i w:val="false"/>
+          <w:iCs w:val="false"/>
+          <w:color w:val="000000"/>
+          <w:sz w:val="24"/>
+          <w:szCs w:val="24"/>
+        </w:rPr>
+        <w:t xml:space="preserve">.</w:t>
       </w:r>
     </w:p>
     <w:p>
@@ -1179,7 +1283,7 @@
           <w:sz w:val="28"/>
           <w:szCs w:val="28"/>
         </w:rPr>
-        <w:t xml:space="preserve">2.4 C1 et C2 — hors périmètre, constat factuel sans comptage</w:t>
+        <w:t xml:space="preserve">2.4 C1 et C2 — transférés à la plateforme sig-web-platform (hors comptage)</w:t>
       </w:r>
     </w:p>
     <w:p>
@@ -1199,7 +1303,7 @@
           <w:sz w:val="24"/>
           <w:szCs w:val="24"/>
         </w:rPr>
-        <w:t xml:space="preserve">Bien que sorties du référentiel révisé, deux observations factuelles méritent d'être consignées pour la suite, sans valeur d'écart. D'une part, l'application d'inscription </w:t>
+        <w:t xml:space="preserve">Ces deux exigences ne relèvent plus du site vitrine : l'inscription des clients est portée par la plateforme sig-web-platform, qui recevra les inscriptions et pour laquelle les comptes seront créés par l'administrateur, et le formulaire de contact complet a été supprimé du cahier des charges révisé. Deux observations factuelles positives sont néanmoins consignées, sans valeur d'écart. D'une part, l'application d'inscription </w:t>
       </w:r>
       <w:r>
         <w:rPr>
@@ -1225,7 +1329,7 @@
           <w:sz w:val="24"/>
           <w:szCs w:val="24"/>
         </w:rPr>
-        <w:t xml:space="preserve"> : la vue leads.signup_view enregistre le lead en base (nom, e-mail, organisation) puis redirige vers l'URL d'inscription de la plateforme. D'autre part, la page Contact reste une page d'information (coordonnées éditées depuis l'admin, carte et réseaux sociaux), sans formulaire — ce qui est cohérent avec le cahier des charges révisé. Deux résidus techniques liés à ces évolutions sont listés au chapitre 5 (protection anti-spam de la route d'inscription et données personnelles transmises dans la chaîne de requête de redirection) et pourront être arbitrés le moment venu.</w:t>
+        <w:t xml:space="preserve"> : la vue leads.signup_view enregistre le lead en base (nom, e-mail, organisation) puis redirige vers l'URL d'inscription de la plateforme — exactement le flux attendu par le modèle « subscribe to the service ». D'autre part, la page Contact reste une page d'information (coordonnées éditées depuis l'admin, carte et réseaux sociaux), conforme au cahier des charges révisé. Deux résidus techniques liés à ces évolutions sont listés au chapitre 5 (protection anti-spam de la route d'inscription et données personnelles transmises dans la chaîne de requête de redirection) et pourront être arbitrés le moment venu.</w:t>
       </w:r>
     </w:p>
     <w:p>
@@ -1242,7 +1346,7 @@
           <w:sz w:val="32"/>
           <w:szCs w:val="32"/>
         </w:rPr>
-        <w:t xml:space="preserve">3. Points majeurs (M1 à M10) : tableau de statut</w:t>
+        <w:t xml:space="preserve">3. Points majeurs actifs (M3 à M10) et points sortis du comptage</w:t>
       </w:r>
     </w:p>
     <w:p>
@@ -1262,7 +1366,7 @@
           <w:sz w:val="24"/>
           <w:szCs w:val="24"/>
         </w:rPr>
-        <w:t xml:space="preserve">Le tableau ci-dessous récapitule le statut de chacun des dix points majeurs, avec la preuve matérielle correspondante. Trois sont faits et vérifiés, deux partiels, quatre reportés au déploiement par décision assumée et un seul ouvert.</w:t>
+        <w:t xml:space="preserve">Le tableau 1 récapitule le statut des huit points majeurs actifs, avec la preuve matérielle correspondante : trois sont faits et vérifiés, quatre sont reportés à la mise en production par décision assumée et un seul est partiel — aucun n'est ouvert. Le tableau 2 consigne les quatre points sortis du comptage (C1, C2, M1, M2) avec la décision produit qui les justifie, afin de conserver une trace d'audit complète.</w:t>
       </w:r>
     </w:p>
     <w:p>
@@ -1279,7 +1383,7 @@
           <w:sz w:val="20"/>
           <w:szCs w:val="20"/>
         </w:rPr>
-        <w:t xml:space="preserve">Tableau 1 — Statut des dix points majeurs</w:t>
+        <w:t xml:space="preserve">Tableau 1 — Statut des huit points majeurs actifs</w:t>
       </w:r>
     </w:p>
     <w:tbl>
@@ -1467,7 +1571,7 @@
                 <w:sz w:val="18"/>
                 <w:szCs w:val="18"/>
               </w:rPr>
-              <w:t xml:space="preserve">M1</w:t>
+              <w:t xml:space="preserve">M3</w:t>
             </w:r>
           </w:p>
         </w:tc>
@@ -1499,7 +1603,7 @@
                 <w:sz w:val="18"/>
                 <w:szCs w:val="18"/>
               </w:rPr>
-              <w:t xml:space="preserve">Page Connexion (redirection vers PLATFORM_LOGIN_URL, bouton dans le header)</w:t>
+              <w:t xml:space="preserve">E-mails transactionnels réels (SMTP/SendGrid, notifications)</w:t>
             </w:r>
           </w:p>
         </w:tc>
@@ -1527,11 +1631,11 @@
                 <w:bCs/>
                 <w:i w:val="false"/>
                 <w:iCs w:val="false"/>
-                <w:color w:val="B9770E"/>
-                <w:sz w:val="18"/>
-                <w:szCs w:val="18"/>
-              </w:rPr>
-              <w:t xml:space="preserve">Partiel</w:t>
+                <w:color w:val="1A4A7A"/>
+                <w:sz w:val="18"/>
+                <w:szCs w:val="18"/>
+              </w:rPr>
+              <w:t xml:space="preserve">Reporté</w:t>
             </w:r>
           </w:p>
         </w:tc>
@@ -1563,7 +1667,7 @@
                 <w:sz w:val="18"/>
                 <w:szCs w:val="18"/>
               </w:rPr>
-              <w:t xml:space="preserve">Pas de page /login/ dédiée ni bouton « Se connecter » ; l'accès passe par le CTA d'inscription du header et le lien plateforme de la page Démo</w:t>
+              <w:t xml:space="preserve">Aucun envoi réel dans le code ; réglages SMTP prêts dans prod.py — activation à la mise en production</w:t>
             </w:r>
           </w:p>
         </w:tc>
@@ -1600,7 +1704,7 @@
                 <w:sz w:val="18"/>
                 <w:szCs w:val="18"/>
               </w:rPr>
-              <w:t xml:space="preserve">M2</w:t>
+              <w:t xml:space="preserve">M4</w:t>
             </w:r>
           </w:p>
         </w:tc>
@@ -1632,7 +1736,7 @@
                 <w:sz w:val="18"/>
                 <w:szCs w:val="18"/>
               </w:rPr>
-              <w:t xml:space="preserve">Réactiver la page Mentions légales (route legal/, lien footer)</w:t>
+              <w:t xml:space="preserve">PostgreSQL en production (DATABASE_URL, vérifier plein texte)</w:t>
             </w:r>
           </w:p>
         </w:tc>
@@ -1660,11 +1764,11 @@
                 <w:bCs/>
                 <w:i w:val="false"/>
                 <w:iCs w:val="false"/>
-                <w:color w:val="C0392B"/>
-                <w:sz w:val="18"/>
-                <w:szCs w:val="18"/>
-              </w:rPr>
-              <w:t xml:space="preserve">Ouvert</w:t>
+                <w:color w:val="1A4A7A"/>
+                <w:sz w:val="18"/>
+                <w:szCs w:val="18"/>
+              </w:rPr>
+              <w:t xml:space="preserve">Reporté</w:t>
             </w:r>
           </w:p>
         </w:tc>
@@ -1696,7 +1800,7 @@
                 <w:sz w:val="18"/>
                 <w:szCs w:val="18"/>
               </w:rPr>
-              <w:t xml:space="preserve">La route est toujours commentée dans pages/urls.py (ligne 10) ; la vue et le gabarit existent — correction de cinq minutes</w:t>
+              <w:t xml:space="preserve">dj-database-url et psycopg2-binary en place ; SQLite conservé en dev, PostgreSQL à activer via l'environnement</w:t>
             </w:r>
           </w:p>
         </w:tc>
@@ -1733,7 +1837,7 @@
                 <w:sz w:val="18"/>
                 <w:szCs w:val="18"/>
               </w:rPr>
-              <w:t xml:space="preserve">M3</w:t>
+              <w:t xml:space="preserve">M5</w:t>
             </w:r>
           </w:p>
         </w:tc>
@@ -1765,7 +1869,7 @@
                 <w:sz w:val="18"/>
                 <w:szCs w:val="18"/>
               </w:rPr>
-              <w:t xml:space="preserve">E-mails transactionnels réels (SMTP/SendGrid, notifications)</w:t>
+              <w:t xml:space="preserve">Fixtures de démonstration et contenu éditorial</w:t>
             </w:r>
           </w:p>
         </w:tc>
@@ -1793,11 +1897,11 @@
                 <w:bCs/>
                 <w:i w:val="false"/>
                 <w:iCs w:val="false"/>
-                <w:color w:val="1A4A7A"/>
-                <w:sz w:val="18"/>
-                <w:szCs w:val="18"/>
-              </w:rPr>
-              <w:t xml:space="preserve">Reporté</w:t>
+                <w:color w:val="1E8449"/>
+                <w:sz w:val="18"/>
+                <w:szCs w:val="18"/>
+              </w:rPr>
+              <w:t xml:space="preserve">Fait</w:t>
             </w:r>
           </w:p>
         </w:tc>
@@ -1829,7 +1933,7 @@
                 <w:sz w:val="18"/>
                 <w:szCs w:val="18"/>
               </w:rPr>
-              <w:t xml:space="preserve">Aucun envoi réel dans le code ; réglages SMTP prêts dans prod.py — activation à la mise en production</w:t>
+              <w:t xml:space="preserve">19 fixtures (accueil, tarifs, footer, politiques…), 5 articles de blog avec catégories, chiffres clés, partenaires et médias fournis</w:t>
             </w:r>
           </w:p>
         </w:tc>
@@ -1866,7 +1970,7 @@
                 <w:sz w:val="18"/>
                 <w:szCs w:val="18"/>
               </w:rPr>
-              <w:t xml:space="preserve">M4</w:t>
+              <w:t xml:space="preserve">M6</w:t>
             </w:r>
           </w:p>
         </w:tc>
@@ -1898,7 +2002,7 @@
                 <w:sz w:val="18"/>
                 <w:szCs w:val="18"/>
               </w:rPr>
-              <w:t xml:space="preserve">PostgreSQL en production (DATABASE_URL, vérifier plein texte)</w:t>
+              <w:t xml:space="preserve">Ajouter le Pass Solidarité (4e offre)</w:t>
             </w:r>
           </w:p>
         </w:tc>
@@ -1926,11 +2030,11 @@
                 <w:bCs/>
                 <w:i w:val="false"/>
                 <w:iCs w:val="false"/>
-                <w:color w:val="1A4A7A"/>
-                <w:sz w:val="18"/>
-                <w:szCs w:val="18"/>
-              </w:rPr>
-              <w:t xml:space="preserve">Reporté</w:t>
+                <w:color w:val="1E8449"/>
+                <w:sz w:val="18"/>
+                <w:szCs w:val="18"/>
+              </w:rPr>
+              <w:t xml:space="preserve">Fait</w:t>
             </w:r>
           </w:p>
         </w:tc>
@@ -1962,7 +2066,7 @@
                 <w:sz w:val="18"/>
                 <w:szCs w:val="18"/>
               </w:rPr>
-              <w:t xml:space="preserve">dj-database-url et psycopg2-binary en place ; SQLite conservé en dev, PostgreSQL à activer via l'environnement</w:t>
+              <w:t xml:space="preserve">Fixture pricing_solidarity.json (badge « Solidarité ») à côté des 3 offres — 4 offres affichées</w:t>
             </w:r>
           </w:p>
         </w:tc>
@@ -1999,7 +2103,7 @@
                 <w:sz w:val="18"/>
                 <w:szCs w:val="18"/>
               </w:rPr>
-              <w:t xml:space="preserve">M5</w:t>
+              <w:t xml:space="preserve">M7</w:t>
             </w:r>
           </w:p>
         </w:tc>
@@ -2031,7 +2135,7 @@
                 <w:sz w:val="18"/>
                 <w:szCs w:val="18"/>
               </w:rPr>
-              <w:t xml:space="preserve">Fixtures de démonstration et contenu éditorial</w:t>
+              <w:t xml:space="preserve">Anti-spam (honeypot + django-ratelimit)</w:t>
             </w:r>
           </w:p>
         </w:tc>
@@ -2095,7 +2199,7 @@
                 <w:sz w:val="18"/>
                 <w:szCs w:val="18"/>
               </w:rPr>
-              <w:t xml:space="preserve">19 fixtures (accueil, tarifs, footer, politiques…), 5 articles de blog avec catégories, chiffres clés, partenaires et médias fournis</w:t>
+              <w:t xml:space="preserve">honeypot + limite 5 POST/min/IP sur la newsletter, 60/m et 120/m GET sur la recherche ; réserve : la route d'inscription POST /signup/ n'est pas encore limitée</w:t>
             </w:r>
           </w:p>
         </w:tc>
@@ -2132,7 +2236,7 @@
                 <w:sz w:val="18"/>
                 <w:szCs w:val="18"/>
               </w:rPr>
-              <w:t xml:space="preserve">M6</w:t>
+              <w:t xml:space="preserve">M8</w:t>
             </w:r>
           </w:p>
         </w:tc>
@@ -2164,7 +2268,7 @@
                 <w:sz w:val="18"/>
                 <w:szCs w:val="18"/>
               </w:rPr>
-              <w:t xml:space="preserve">Ajouter le Pass Solidarité (4e offre)</w:t>
+              <w:t xml:space="preserve">Chaîne de déploiement (VPS, Nginx/Gunicorn, CI/CD)</w:t>
             </w:r>
           </w:p>
         </w:tc>
@@ -2192,11 +2296,11 @@
                 <w:bCs/>
                 <w:i w:val="false"/>
                 <w:iCs w:val="false"/>
-                <w:color w:val="1E8449"/>
-                <w:sz w:val="18"/>
-                <w:szCs w:val="18"/>
-              </w:rPr>
-              <w:t xml:space="preserve">Fait</w:t>
+                <w:color w:val="1A4A7A"/>
+                <w:sz w:val="18"/>
+                <w:szCs w:val="18"/>
+              </w:rPr>
+              <w:t xml:space="preserve">Reporté</w:t>
             </w:r>
           </w:p>
         </w:tc>
@@ -2228,7 +2332,7 @@
                 <w:sz w:val="18"/>
                 <w:szCs w:val="18"/>
               </w:rPr>
-              <w:t xml:space="preserve">Fixture pricing_solidarity.json (badge « Solidarité ») à côté des 3 offres — 4 offres affichées</w:t>
+              <w:t xml:space="preserve">Aucun Dockerfile ni workflow dans le livrable — cohérent avec la décision (phase déploiement)</w:t>
             </w:r>
           </w:p>
         </w:tc>
@@ -2265,7 +2369,7 @@
                 <w:sz w:val="18"/>
                 <w:szCs w:val="18"/>
               </w:rPr>
-              <w:t xml:space="preserve">M7</w:t>
+              <w:t xml:space="preserve">M9</w:t>
             </w:r>
           </w:p>
         </w:tc>
@@ -2297,7 +2401,7 @@
                 <w:sz w:val="18"/>
                 <w:szCs w:val="18"/>
               </w:rPr>
-              <w:t xml:space="preserve">Anti-spam (honeypot + django-ratelimit)</w:t>
+              <w:t xml:space="preserve">Documentation (guide admin, déploiement, sauvegarde/restauration)</w:t>
             </w:r>
           </w:p>
         </w:tc>
@@ -2325,11 +2429,11 @@
                 <w:bCs/>
                 <w:i w:val="false"/>
                 <w:iCs w:val="false"/>
-                <w:color w:val="1E8449"/>
-                <w:sz w:val="18"/>
-                <w:szCs w:val="18"/>
-              </w:rPr>
-              <w:t xml:space="preserve">Fait</w:t>
+                <w:color w:val="B9770E"/>
+                <w:sz w:val="18"/>
+                <w:szCs w:val="18"/>
+              </w:rPr>
+              <w:t xml:space="preserve">Partiel</w:t>
             </w:r>
           </w:p>
         </w:tc>
@@ -2361,7 +2465,7 @@
                 <w:sz w:val="18"/>
                 <w:szCs w:val="18"/>
               </w:rPr>
-              <w:t xml:space="preserve">honeypot + limite 5 POST/min/IP sur la newsletter, 60/m et 120/m GET sur la recherche ; réserve : la route d'inscription POST /signup/ n'est pas encore limitée</w:t>
+              <w:t xml:space="preserve">README détaillé (installation, configuration, déploiement Contabo) ; il manque un guide administrateur et la procédure de sauvegarde/restauration</w:t>
             </w:r>
           </w:p>
         </w:tc>
@@ -2398,7 +2502,7 @@
                 <w:sz w:val="18"/>
                 <w:szCs w:val="18"/>
               </w:rPr>
-              <w:t xml:space="preserve">M8</w:t>
+              <w:t xml:space="preserve">M10</w:t>
             </w:r>
           </w:p>
         </w:tc>
@@ -2430,7 +2534,7 @@
                 <w:sz w:val="18"/>
                 <w:szCs w:val="18"/>
               </w:rPr>
-              <w:t xml:space="preserve">Chaîne de déploiement (VPS, Nginx/Gunicorn, CI/CD)</w:t>
+              <w:t xml:space="preserve">Verrouiller les dépendances (dédoublonner, lock, pip-audit)</w:t>
             </w:r>
           </w:p>
         </w:tc>
@@ -2494,7 +2598,195 @@
                 <w:sz w:val="18"/>
                 <w:szCs w:val="18"/>
               </w:rPr>
-              <w:t xml:space="preserve">Aucun Dockerfile ni workflow dans le livrable — cohérent avec la décision (phase déploiement)</w:t>
+              <w:t xml:space="preserve">requirements.txt contient encore un bloc dupliqué (21 doublons) ; fichier de lock et pip-audit à produire au déploiement</w:t>
+            </w:r>
+          </w:p>
+        </w:tc>
+      </w:tr>
+    </w:tbl>
+    <w:p>
+      <w:pPr>
+        <w:spacing w:after="220" w:before="60" w:line="312"/>
+        <w:jc w:val="center"/>
+      </w:pPr>
+      <w:r>
+        <w:rPr>
+          <w:rFonts w:ascii="Times New Roman" w:eastAsia="Times New Roman" w:hAnsi="Times New Roman"/>
+          <w:i/>
+          <w:iCs/>
+          <w:color w:val="5A7A96"/>
+          <w:sz w:val="18"/>
+          <w:szCs w:val="18"/>
+        </w:rPr>
+        <w:t xml:space="preserve">Statut par point actif, avec preuve sourcée dans l'archive (fichiers, fixtures, résultats de commandes)</w:t>
+      </w:r>
+    </w:p>
+    <w:p>
+      <w:pPr>
+        <w:keepNext/>
+        <w:spacing w:after="90" w:before="160" w:line="312"/>
+      </w:pPr>
+      <w:r>
+        <w:rPr>
+          <w:rFonts w:ascii="Times New Roman" w:eastAsia="Times New Roman" w:hAnsi="Times New Roman"/>
+          <w:b/>
+          <w:bCs/>
+          <w:color w:val="1A4A7A"/>
+          <w:sz w:val="20"/>
+          <w:szCs w:val="20"/>
+        </w:rPr>
+        <w:t xml:space="preserve">Tableau 2 — Points sortis du comptage : décisions produit actées</w:t>
+      </w:r>
+    </w:p>
+    <w:tbl>
+      <w:tblPr>
+        <w:tblW w:type="pct" w:w="100%"/>
+        <w:tblBorders>
+          <w:top w:val="single" w:color="1A4A7A" w:sz="6"/>
+          <w:left w:val="none" w:color="FFFFFF" w:sz="0"/>
+          <w:bottom w:val="single" w:color="1A4A7A" w:sz="6"/>
+          <w:right w:val="none" w:color="FFFFFF" w:sz="0"/>
+          <w:insideH w:val="single" w:color="C0D0E2" w:sz="2"/>
+          <w:insideV w:val="none" w:color="FFFFFF" w:sz="0"/>
+        </w:tblBorders>
+        <w:tblLayout w:type="fixed"/>
+      </w:tblPr>
+      <w:tblGrid>
+        <w:gridCol w:w="100"/>
+        <w:gridCol w:w="100"/>
+        <w:gridCol w:w="100"/>
+        <w:gridCol w:w="100"/>
+      </w:tblGrid>
+      <w:tr>
+        <w:trPr>
+          <w:cantSplit/>
+          <w:tblHeader/>
+        </w:trPr>
+        <w:tc>
+          <w:tcPr>
+            <w:tcW w:type="pct" w:w="8%"/>
+            <w:shd w:fill="1A4A7A" w:val="clear"/>
+            <w:tcMar>
+              <w:top w:type="dxa" w:w="70"/>
+              <w:left w:type="dxa" w:w="110"/>
+              <w:bottom w:type="dxa" w:w="70"/>
+              <w:right w:type="dxa" w:w="110"/>
+            </w:tcMar>
+            <w:vAlign w:val="center"/>
+          </w:tcPr>
+          <w:p>
+            <w:pPr>
+              <w:spacing w:after="20" w:line="276"/>
+              <w:jc w:val="left"/>
+            </w:pPr>
+            <w:r>
+              <w:rPr>
+                <w:rFonts w:ascii="Times New Roman" w:eastAsia="Times New Roman" w:hAnsi="Times New Roman"/>
+                <w:b/>
+                <w:bCs/>
+                <w:i w:val="false"/>
+                <w:iCs w:val="false"/>
+                <w:color w:val="FFFFFF"/>
+                <w:sz w:val="20"/>
+                <w:szCs w:val="20"/>
+              </w:rPr>
+              <w:t xml:space="preserve">N°</w:t>
+            </w:r>
+          </w:p>
+        </w:tc>
+        <w:tc>
+          <w:tcPr>
+            <w:tcW w:type="pct" w:w="27%"/>
+            <w:shd w:fill="1A4A7A" w:val="clear"/>
+            <w:tcMar>
+              <w:top w:type="dxa" w:w="70"/>
+              <w:left w:type="dxa" w:w="110"/>
+              <w:bottom w:type="dxa" w:w="70"/>
+              <w:right w:type="dxa" w:w="110"/>
+            </w:tcMar>
+            <w:vAlign w:val="center"/>
+          </w:tcPr>
+          <w:p>
+            <w:pPr>
+              <w:spacing w:after="20" w:line="276"/>
+              <w:jc w:val="left"/>
+            </w:pPr>
+            <w:r>
+              <w:rPr>
+                <w:rFonts w:ascii="Times New Roman" w:eastAsia="Times New Roman" w:hAnsi="Times New Roman"/>
+                <w:b/>
+                <w:bCs/>
+                <w:i w:val="false"/>
+                <w:iCs w:val="false"/>
+                <w:color w:val="FFFFFF"/>
+                <w:sz w:val="20"/>
+                <w:szCs w:val="20"/>
+              </w:rPr>
+              <w:t xml:space="preserve">Objet (rappel)</w:t>
+            </w:r>
+          </w:p>
+        </w:tc>
+        <w:tc>
+          <w:tcPr>
+            <w:tcW w:type="pct" w:w="13%"/>
+            <w:shd w:fill="1A4A7A" w:val="clear"/>
+            <w:tcMar>
+              <w:top w:type="dxa" w:w="70"/>
+              <w:left w:type="dxa" w:w="110"/>
+              <w:bottom w:type="dxa" w:w="70"/>
+              <w:right w:type="dxa" w:w="110"/>
+            </w:tcMar>
+            <w:vAlign w:val="center"/>
+          </w:tcPr>
+          <w:p>
+            <w:pPr>
+              <w:spacing w:after="20" w:line="276"/>
+              <w:jc w:val="left"/>
+            </w:pPr>
+            <w:r>
+              <w:rPr>
+                <w:rFonts w:ascii="Times New Roman" w:eastAsia="Times New Roman" w:hAnsi="Times New Roman"/>
+                <w:b/>
+                <w:bCs/>
+                <w:i w:val="false"/>
+                <w:iCs w:val="false"/>
+                <w:color w:val="FFFFFF"/>
+                <w:sz w:val="20"/>
+                <w:szCs w:val="20"/>
+              </w:rPr>
+              <w:t xml:space="preserve">Règle</w:t>
+            </w:r>
+          </w:p>
+        </w:tc>
+        <w:tc>
+          <w:tcPr>
+            <w:tcW w:type="pct" w:w="52%"/>
+            <w:shd w:fill="1A4A7A" w:val="clear"/>
+            <w:tcMar>
+              <w:top w:type="dxa" w:w="70"/>
+              <w:left w:type="dxa" w:w="110"/>
+              <w:bottom w:type="dxa" w:w="70"/>
+              <w:right w:type="dxa" w:w="110"/>
+            </w:tcMar>
+            <w:vAlign w:val="center"/>
+          </w:tcPr>
+          <w:p>
+            <w:pPr>
+              <w:spacing w:after="20" w:line="276"/>
+              <w:jc w:val="left"/>
+            </w:pPr>
+            <w:r>
+              <w:rPr>
+                <w:rFonts w:ascii="Times New Roman" w:eastAsia="Times New Roman" w:hAnsi="Times New Roman"/>
+                <w:b/>
+                <w:bCs/>
+                <w:i w:val="false"/>
+                <w:iCs w:val="false"/>
+                <w:color w:val="FFFFFF"/>
+                <w:sz w:val="20"/>
+                <w:szCs w:val="20"/>
+              </w:rPr>
+              <w:t xml:space="preserve">Décision du client</w:t>
             </w:r>
           </w:p>
         </w:tc>
@@ -2505,7 +2797,7 @@
         </w:trPr>
         <w:tc>
           <w:tcPr>
-            <w:tcW w:type="pct" w:w="7%"/>
+            <w:tcW w:type="pct" w:w="8%"/>
             <w:shd w:fill="FFFFFF" w:val="clear"/>
             <w:tcMar>
               <w:top w:type="dxa" w:w="60"/>
@@ -2531,13 +2823,13 @@
                 <w:sz w:val="18"/>
                 <w:szCs w:val="18"/>
               </w:rPr>
-              <w:t xml:space="preserve">M9</w:t>
-            </w:r>
-          </w:p>
-        </w:tc>
-        <w:tc>
-          <w:tcPr>
-            <w:tcW w:type="pct" w:w="30%"/>
+              <w:t xml:space="preserve">C1</w:t>
+            </w:r>
+          </w:p>
+        </w:tc>
+        <w:tc>
+          <w:tcPr>
+            <w:tcW w:type="pct" w:w="27%"/>
             <w:shd w:fill="FFFFFF" w:val="clear"/>
             <w:tcMar>
               <w:top w:type="dxa" w:w="60"/>
@@ -2563,13 +2855,13 @@
                 <w:sz w:val="18"/>
                 <w:szCs w:val="18"/>
               </w:rPr>
-              <w:t xml:space="preserve">Documentation (guide admin, déploiement, sauvegarde/restauration)</w:t>
-            </w:r>
-          </w:p>
-        </w:tc>
-        <w:tc>
-          <w:tcPr>
-            <w:tcW w:type="pct" w:w="12%"/>
+              <w:t xml:space="preserve">Formulaire d'inscription en ligne</w:t>
+            </w:r>
+          </w:p>
+        </w:tc>
+        <w:tc>
+          <w:tcPr>
+            <w:tcW w:type="pct" w:w="13%"/>
             <w:shd w:fill="FFFFFF" w:val="clear"/>
             <w:tcMar>
               <w:top w:type="dxa" w:w="60"/>
@@ -2591,17 +2883,17 @@
                 <w:bCs/>
                 <w:i w:val="false"/>
                 <w:iCs w:val="false"/>
-                <w:color w:val="B9770E"/>
-                <w:sz w:val="18"/>
-                <w:szCs w:val="18"/>
-              </w:rPr>
-              <w:t xml:space="preserve">Partiel</w:t>
-            </w:r>
-          </w:p>
-        </w:tc>
-        <w:tc>
-          <w:tcPr>
-            <w:tcW w:type="pct" w:w="51%"/>
+                <w:color w:val="5A7A96"/>
+                <w:sz w:val="18"/>
+                <w:szCs w:val="18"/>
+              </w:rPr>
+              <w:t xml:space="preserve">Transféré</w:t>
+            </w:r>
+          </w:p>
+        </w:tc>
+        <w:tc>
+          <w:tcPr>
+            <w:tcW w:type="pct" w:w="52%"/>
             <w:shd w:fill="FFFFFF" w:val="clear"/>
             <w:tcMar>
               <w:top w:type="dxa" w:w="60"/>
@@ -2627,7 +2919,7 @@
                 <w:sz w:val="18"/>
                 <w:szCs w:val="18"/>
               </w:rPr>
-              <w:t xml:space="preserve">README détaillé (installation, configuration, déploiement Contabo) ; il manque un guide administrateur et la procédure de sauvegarde/restauration</w:t>
+              <w:t xml:space="preserve">Pris en charge par la plateforme sig-web-platform, qui reçoit les inscriptions ; le cahier des charges révisé ne l'exige plus sur la vitrine</w:t>
             </w:r>
           </w:p>
         </w:tc>
@@ -2638,7 +2930,7 @@
         </w:trPr>
         <w:tc>
           <w:tcPr>
-            <w:tcW w:type="pct" w:w="7%"/>
+            <w:tcW w:type="pct" w:w="8%"/>
             <w:shd w:fill="EEF3FA" w:val="clear"/>
             <w:tcMar>
               <w:top w:type="dxa" w:w="60"/>
@@ -2664,13 +2956,13 @@
                 <w:sz w:val="18"/>
                 <w:szCs w:val="18"/>
               </w:rPr>
-              <w:t xml:space="preserve">M10</w:t>
-            </w:r>
-          </w:p>
-        </w:tc>
-        <w:tc>
-          <w:tcPr>
-            <w:tcW w:type="pct" w:w="30%"/>
+              <w:t xml:space="preserve">C2</w:t>
+            </w:r>
+          </w:p>
+        </w:tc>
+        <w:tc>
+          <w:tcPr>
+            <w:tcW w:type="pct" w:w="27%"/>
             <w:shd w:fill="EEF3FA" w:val="clear"/>
             <w:tcMar>
               <w:top w:type="dxa" w:w="60"/>
@@ -2696,13 +2988,13 @@
                 <w:sz w:val="18"/>
                 <w:szCs w:val="18"/>
               </w:rPr>
-              <w:t xml:space="preserve">Verrouiller les dépendances (dédoublonner, lock, pip-audit)</w:t>
-            </w:r>
-          </w:p>
-        </w:tc>
-        <w:tc>
-          <w:tcPr>
-            <w:tcW w:type="pct" w:w="12%"/>
+              <w:t xml:space="preserve">Formulaire de la page Contact</w:t>
+            </w:r>
+          </w:p>
+        </w:tc>
+        <w:tc>
+          <w:tcPr>
+            <w:tcW w:type="pct" w:w="13%"/>
             <w:shd w:fill="EEF3FA" w:val="clear"/>
             <w:tcMar>
               <w:top w:type="dxa" w:w="60"/>
@@ -2724,17 +3016,17 @@
                 <w:bCs/>
                 <w:i w:val="false"/>
                 <w:iCs w:val="false"/>
-                <w:color w:val="1A4A7A"/>
-                <w:sz w:val="18"/>
-                <w:szCs w:val="18"/>
-              </w:rPr>
-              <w:t xml:space="preserve">Reporté</w:t>
-            </w:r>
-          </w:p>
-        </w:tc>
-        <w:tc>
-          <w:tcPr>
-            <w:tcW w:type="pct" w:w="51%"/>
+                <w:color w:val="5A7A96"/>
+                <w:sz w:val="18"/>
+                <w:szCs w:val="18"/>
+              </w:rPr>
+              <w:t xml:space="preserve">Transféré</w:t>
+            </w:r>
+          </w:p>
+        </w:tc>
+        <w:tc>
+          <w:tcPr>
+            <w:tcW w:type="pct" w:w="52%"/>
             <w:shd w:fill="EEF3FA" w:val="clear"/>
             <w:tcMar>
               <w:top w:type="dxa" w:w="60"/>
@@ -2760,7 +3052,406 @@
                 <w:sz w:val="18"/>
                 <w:szCs w:val="18"/>
               </w:rPr>
-              <w:t xml:space="preserve">requirements.txt contient encore un bloc dupliqué (21 doublons) ; fichier de lock et pip-audit à produire au déploiement</w:t>
+              <w:t xml:space="preserve">Exigence supprimée du cahier des charges révisé ; la page Contact reste une page d'information</w:t>
+            </w:r>
+          </w:p>
+        </w:tc>
+      </w:tr>
+      <w:tr>
+        <w:trPr>
+          <w:cantSplit/>
+        </w:trPr>
+        <w:tc>
+          <w:tcPr>
+            <w:tcW w:type="pct" w:w="8%"/>
+            <w:shd w:fill="FFFFFF" w:val="clear"/>
+            <w:tcMar>
+              <w:top w:type="dxa" w:w="60"/>
+              <w:left w:type="dxa" w:w="110"/>
+              <w:bottom w:type="dxa" w:w="60"/>
+              <w:right w:type="dxa" w:w="110"/>
+            </w:tcMar>
+            <w:vAlign w:val="center"/>
+          </w:tcPr>
+          <w:p>
+            <w:pPr>
+              <w:spacing w:after="20" w:line="276"/>
+              <w:jc w:val="left"/>
+            </w:pPr>
+            <w:r>
+              <w:rPr>
+                <w:rFonts w:ascii="Times New Roman" w:eastAsia="Times New Roman" w:hAnsi="Times New Roman"/>
+                <w:b w:val="false"/>
+                <w:bCs w:val="false"/>
+                <w:i w:val="false"/>
+                <w:iCs w:val="false"/>
+                <w:color w:val="000000"/>
+                <w:sz w:val="18"/>
+                <w:szCs w:val="18"/>
+              </w:rPr>
+              <w:t xml:space="preserve">M1</w:t>
+            </w:r>
+          </w:p>
+        </w:tc>
+        <w:tc>
+          <w:tcPr>
+            <w:tcW w:type="pct" w:w="27%"/>
+            <w:shd w:fill="FFFFFF" w:val="clear"/>
+            <w:tcMar>
+              <w:top w:type="dxa" w:w="60"/>
+              <w:left w:type="dxa" w:w="110"/>
+              <w:bottom w:type="dxa" w:w="60"/>
+              <w:right w:type="dxa" w:w="110"/>
+            </w:tcMar>
+            <w:vAlign w:val="center"/>
+          </w:tcPr>
+          <w:p>
+            <w:pPr>
+              <w:spacing w:after="20" w:line="276"/>
+              <w:jc w:val="left"/>
+            </w:pPr>
+            <w:r>
+              <w:rPr>
+                <w:rFonts w:ascii="Times New Roman" w:eastAsia="Times New Roman" w:hAnsi="Times New Roman"/>
+                <w:b w:val="false"/>
+                <w:bCs w:val="false"/>
+                <w:i w:val="false"/>
+                <w:iCs w:val="false"/>
+                <w:color w:val="000000"/>
+                <w:sz w:val="18"/>
+                <w:szCs w:val="18"/>
+              </w:rPr>
+              <w:t xml:space="preserve">Page Connexion dédiée (bouton dans le header)</w:t>
+            </w:r>
+          </w:p>
+        </w:tc>
+        <w:tc>
+          <w:tcPr>
+            <w:tcW w:type="pct" w:w="13%"/>
+            <w:shd w:fill="FFFFFF" w:val="clear"/>
+            <w:tcMar>
+              <w:top w:type="dxa" w:w="60"/>
+              <w:left w:type="dxa" w:w="110"/>
+              <w:bottom w:type="dxa" w:w="60"/>
+              <w:right w:type="dxa" w:w="110"/>
+            </w:tcMar>
+            <w:vAlign w:val="center"/>
+          </w:tcPr>
+          <w:p>
+            <w:pPr>
+              <w:spacing w:after="20" w:line="276"/>
+              <w:jc w:val="left"/>
+            </w:pPr>
+            <w:r>
+              <w:rPr>
+                <w:rFonts w:ascii="Times New Roman" w:eastAsia="Times New Roman" w:hAnsi="Times New Roman"/>
+                <w:b/>
+                <w:bCs/>
+                <w:i w:val="false"/>
+                <w:iCs w:val="false"/>
+                <w:color w:val="5A7A96"/>
+                <w:sz w:val="18"/>
+                <w:szCs w:val="18"/>
+              </w:rPr>
+              <w:t xml:space="preserve">Non applicable</w:t>
+            </w:r>
+          </w:p>
+        </w:tc>
+        <w:tc>
+          <w:tcPr>
+            <w:tcW w:type="pct" w:w="52%"/>
+            <w:shd w:fill="FFFFFF" w:val="clear"/>
+            <w:tcMar>
+              <w:top w:type="dxa" w:w="60"/>
+              <w:left w:type="dxa" w:w="110"/>
+              <w:bottom w:type="dxa" w:w="60"/>
+              <w:right w:type="dxa" w:w="110"/>
+            </w:tcMar>
+            <w:vAlign w:val="center"/>
+          </w:tcPr>
+          <w:p>
+            <w:pPr>
+              <w:spacing w:after="20" w:line="276"/>
+              <w:jc w:val="left"/>
+            </w:pPr>
+            <w:r>
+              <w:rPr>
+                <w:rFonts w:ascii="Times New Roman" w:eastAsia="Times New Roman" w:hAnsi="Times New Roman"/>
+                <w:b w:val="false"/>
+                <w:bCs w:val="false"/>
+                <w:i w:val="false"/>
+                <w:iCs w:val="false"/>
+                <w:color w:val="000000"/>
+                <w:sz w:val="18"/>
+                <w:szCs w:val="18"/>
+              </w:rPr>
+              <w:t xml:space="preserve">Choix produit assumé : le client s'inscrit (« subscribe to the service »), l'administrateur reçoit l'inscription et crée le compte d'accès à la plateforme (non encore développée)</w:t>
+            </w:r>
+          </w:p>
+        </w:tc>
+      </w:tr>
+      <w:tr>
+        <w:trPr>
+          <w:cantSplit/>
+        </w:trPr>
+        <w:tc>
+          <w:tcPr>
+            <w:tcW w:type="pct" w:w="8%"/>
+            <w:shd w:fill="EEF3FA" w:val="clear"/>
+            <w:tcMar>
+              <w:top w:type="dxa" w:w="60"/>
+              <w:left w:type="dxa" w:w="110"/>
+              <w:bottom w:type="dxa" w:w="60"/>
+              <w:right w:type="dxa" w:w="110"/>
+            </w:tcMar>
+            <w:vAlign w:val="center"/>
+          </w:tcPr>
+          <w:p>
+            <w:pPr>
+              <w:spacing w:after="20" w:line="276"/>
+              <w:jc w:val="left"/>
+            </w:pPr>
+            <w:r>
+              <w:rPr>
+                <w:rFonts w:ascii="Times New Roman" w:eastAsia="Times New Roman" w:hAnsi="Times New Roman"/>
+                <w:b w:val="false"/>
+                <w:bCs w:val="false"/>
+                <w:i w:val="false"/>
+                <w:iCs w:val="false"/>
+                <w:color w:val="000000"/>
+                <w:sz w:val="18"/>
+                <w:szCs w:val="18"/>
+              </w:rPr>
+              <w:t xml:space="preserve">M2</w:t>
+            </w:r>
+          </w:p>
+        </w:tc>
+        <w:tc>
+          <w:tcPr>
+            <w:tcW w:type="pct" w:w="27%"/>
+            <w:shd w:fill="EEF3FA" w:val="clear"/>
+            <w:tcMar>
+              <w:top w:type="dxa" w:w="60"/>
+              <w:left w:type="dxa" w:w="110"/>
+              <w:bottom w:type="dxa" w:w="60"/>
+              <w:right w:type="dxa" w:w="110"/>
+            </w:tcMar>
+            <w:vAlign w:val="center"/>
+          </w:tcPr>
+          <w:p>
+            <w:pPr>
+              <w:spacing w:after="20" w:line="276"/>
+              <w:jc w:val="left"/>
+            </w:pPr>
+            <w:r>
+              <w:rPr>
+                <w:rFonts w:ascii="Times New Roman" w:eastAsia="Times New Roman" w:hAnsi="Times New Roman"/>
+                <w:b w:val="false"/>
+                <w:bCs w:val="false"/>
+                <w:i w:val="false"/>
+                <w:iCs w:val="false"/>
+                <w:color w:val="000000"/>
+                <w:sz w:val="18"/>
+                <w:szCs w:val="18"/>
+              </w:rPr>
+              <w:t xml:space="preserve">Réactiver la page Mentions légales (route legal/)</w:t>
+            </w:r>
+          </w:p>
+        </w:tc>
+        <w:tc>
+          <w:tcPr>
+            <w:tcW w:type="pct" w:w="13%"/>
+            <w:shd w:fill="EEF3FA" w:val="clear"/>
+            <w:tcMar>
+              <w:top w:type="dxa" w:w="60"/>
+              <w:left w:type="dxa" w:w="110"/>
+              <w:bottom w:type="dxa" w:w="60"/>
+              <w:right w:type="dxa" w:w="110"/>
+            </w:tcMar>
+            <w:vAlign w:val="center"/>
+          </w:tcPr>
+          <w:p>
+            <w:pPr>
+              <w:spacing w:after="20" w:line="276"/>
+              <w:jc w:val="left"/>
+            </w:pPr>
+            <w:r>
+              <w:rPr>
+                <w:rFonts w:ascii="Times New Roman" w:eastAsia="Times New Roman" w:hAnsi="Times New Roman"/>
+                <w:b/>
+                <w:bCs/>
+                <w:i w:val="false"/>
+                <w:iCs w:val="false"/>
+                <w:color w:val="5A7A96"/>
+                <w:sz w:val="18"/>
+                <w:szCs w:val="18"/>
+              </w:rPr>
+              <w:t xml:space="preserve">Non applicable</w:t>
+            </w:r>
+          </w:p>
+        </w:tc>
+        <w:tc>
+          <w:tcPr>
+            <w:tcW w:type="pct" w:w="52%"/>
+            <w:shd w:fill="EEF3FA" w:val="clear"/>
+            <w:tcMar>
+              <w:top w:type="dxa" w:w="60"/>
+              <w:left w:type="dxa" w:w="110"/>
+              <w:bottom w:type="dxa" w:w="60"/>
+              <w:right w:type="dxa" w:w="110"/>
+            </w:tcMar>
+            <w:vAlign w:val="center"/>
+          </w:tcPr>
+          <w:p>
+            <w:pPr>
+              <w:spacing w:after="20" w:line="276"/>
+              <w:jc w:val="left"/>
+            </w:pPr>
+            <w:r>
+              <w:rPr>
+                <w:rFonts w:ascii="Times New Roman" w:eastAsia="Times New Roman" w:hAnsi="Times New Roman"/>
+                <w:b w:val="false"/>
+                <w:bCs w:val="false"/>
+                <w:i w:val="false"/>
+                <w:iCs w:val="false"/>
+                <w:color w:val="000000"/>
+                <w:sz w:val="18"/>
+                <w:szCs w:val="18"/>
+              </w:rPr>
+              <w:t xml:space="preserve">Décision volontaire assumée : la route reste désactivée ; le point n'est plus considéré comme un écart</w:t>
+            </w:r>
+          </w:p>
+        </w:tc>
+      </w:tr>
+      <w:tr>
+        <w:trPr>
+          <w:cantSplit/>
+        </w:trPr>
+        <w:tc>
+          <w:tcPr>
+            <w:tcW w:type="pct" w:w="8%"/>
+            <w:shd w:fill="FFFFFF" w:val="clear"/>
+            <w:tcMar>
+              <w:top w:type="dxa" w:w="60"/>
+              <w:left w:type="dxa" w:w="110"/>
+              <w:bottom w:type="dxa" w:w="60"/>
+              <w:right w:type="dxa" w:w="110"/>
+            </w:tcMar>
+            <w:vAlign w:val="center"/>
+          </w:tcPr>
+          <w:p>
+            <w:pPr>
+              <w:spacing w:after="20" w:line="276"/>
+              <w:jc w:val="left"/>
+            </w:pPr>
+            <w:r>
+              <w:rPr>
+                <w:rFonts w:ascii="Times New Roman" w:eastAsia="Times New Roman" w:hAnsi="Times New Roman"/>
+                <w:b w:val="false"/>
+                <w:bCs w:val="false"/>
+                <w:i w:val="false"/>
+                <w:iCs w:val="false"/>
+                <w:color w:val="000000"/>
+                <w:sz w:val="18"/>
+                <w:szCs w:val="18"/>
+              </w:rPr>
+              <w:t xml:space="preserve">m1-m11</w:t>
+            </w:r>
+          </w:p>
+        </w:tc>
+        <w:tc>
+          <w:tcPr>
+            <w:tcW w:type="pct" w:w="27%"/>
+            <w:shd w:fill="FFFFFF" w:val="clear"/>
+            <w:tcMar>
+              <w:top w:type="dxa" w:w="60"/>
+              <w:left w:type="dxa" w:w="110"/>
+              <w:bottom w:type="dxa" w:w="60"/>
+              <w:right w:type="dxa" w:w="110"/>
+            </w:tcMar>
+            <w:vAlign w:val="center"/>
+          </w:tcPr>
+          <w:p>
+            <w:pPr>
+              <w:spacing w:after="20" w:line="276"/>
+              <w:jc w:val="left"/>
+            </w:pPr>
+            <w:r>
+              <w:rPr>
+                <w:rFonts w:ascii="Times New Roman" w:eastAsia="Times New Roman" w:hAnsi="Times New Roman"/>
+                <w:b w:val="false"/>
+                <w:bCs w:val="false"/>
+                <w:i w:val="false"/>
+                <w:iCs w:val="false"/>
+                <w:color w:val="000000"/>
+                <w:sz w:val="18"/>
+                <w:szCs w:val="18"/>
+              </w:rPr>
+              <w:t xml:space="preserve">Onze actions mineures</w:t>
+            </w:r>
+          </w:p>
+        </w:tc>
+        <w:tc>
+          <w:tcPr>
+            <w:tcW w:type="pct" w:w="13%"/>
+            <w:shd w:fill="FFFFFF" w:val="clear"/>
+            <w:tcMar>
+              <w:top w:type="dxa" w:w="60"/>
+              <w:left w:type="dxa" w:w="110"/>
+              <w:bottom w:type="dxa" w:w="60"/>
+              <w:right w:type="dxa" w:w="110"/>
+            </w:tcMar>
+            <w:vAlign w:val="center"/>
+          </w:tcPr>
+          <w:p>
+            <w:pPr>
+              <w:spacing w:after="20" w:line="276"/>
+              <w:jc w:val="left"/>
+            </w:pPr>
+            <w:r>
+              <w:rPr>
+                <w:rFonts w:ascii="Times New Roman" w:eastAsia="Times New Roman" w:hAnsi="Times New Roman"/>
+                <w:b/>
+                <w:bCs/>
+                <w:i w:val="false"/>
+                <w:iCs w:val="false"/>
+                <w:color w:val="5A7A96"/>
+                <w:sz w:val="18"/>
+                <w:szCs w:val="18"/>
+              </w:rPr>
+              <w:t xml:space="preserve">Ignorées</w:t>
+            </w:r>
+          </w:p>
+        </w:tc>
+        <w:tc>
+          <w:tcPr>
+            <w:tcW w:type="pct" w:w="52%"/>
+            <w:shd w:fill="FFFFFF" w:val="clear"/>
+            <w:tcMar>
+              <w:top w:type="dxa" w:w="60"/>
+              <w:left w:type="dxa" w:w="110"/>
+              <w:bottom w:type="dxa" w:w="60"/>
+              <w:right w:type="dxa" w:w="110"/>
+            </w:tcMar>
+            <w:vAlign w:val="center"/>
+          </w:tcPr>
+          <w:p>
+            <w:pPr>
+              <w:spacing w:after="20" w:line="276"/>
+              <w:jc w:val="left"/>
+            </w:pPr>
+            <w:r>
+              <w:rPr>
+                <w:rFonts w:ascii="Times New Roman" w:eastAsia="Times New Roman" w:hAnsi="Times New Roman"/>
+                <w:b w:val="false"/>
+                <w:bCs w:val="false"/>
+                <w:i w:val="false"/>
+                <w:iCs w:val="false"/>
+                <w:color w:val="000000"/>
+                <w:sz w:val="18"/>
+                <w:szCs w:val="18"/>
+              </w:rPr>
+              <w:t xml:space="preserve">Hors décompte et hors score, par décision assumée</w:t>
             </w:r>
           </w:p>
         </w:tc>
@@ -2780,7 +3471,7 @@
           <w:sz w:val="18"/>
           <w:szCs w:val="18"/>
         </w:rPr>
-        <w:t xml:space="preserve">Statut par point, avec preuve sourcée dans l'archive (fichiers, fixtures, résultats de commandes)</w:t>
+        <w:t xml:space="preserve">Trace d'audit des exclusions de périmètre — aucun de ces points n'entre dans le taux de réalisation</w:t>
       </w:r>
     </w:p>
     <w:p>
@@ -2800,7 +3491,7 @@
           <w:sz w:val="24"/>
           <w:szCs w:val="24"/>
         </w:rPr>
-        <w:t xml:space="preserve">Deux précisions éclairent les statuts partiels. Sur </w:t>
+        <w:t xml:space="preserve">Une précision éclaire le seul statut non franc. Sur </w:t>
       </w:r>
       <w:r>
         <w:rPr>
@@ -2813,7 +3504,7 @@
           <w:sz w:val="24"/>
           <w:szCs w:val="24"/>
         </w:rPr>
-        <w:t xml:space="preserve">M1</w:t>
+        <w:t xml:space="preserve">M9</w:t>
       </w:r>
       <w:r>
         <w:rPr>
@@ -2826,33 +3517,7 @@
           <w:sz w:val="24"/>
           <w:szCs w:val="24"/>
         </w:rPr>
-        <w:t xml:space="preserve">, le flux réel de l'utilisateur est déjà couvert : le bouton principal du header mène au formulaire d'inscription fonctionnel et la page Démo expose un lien vers la connexion de la plateforme via PLATFORM_LOGIN_URL ; il reste à trancher si un bouton « Se connecter » distinct doit apparaître dans le header, auquel cas une dizaine de lignes suffisent. Sur </w:t>
-      </w:r>
-      <w:r>
-        <w:rPr>
-          <w:rFonts w:ascii="Times New Roman" w:eastAsia="Times New Roman" w:hAnsi="Times New Roman"/>
-          <w:b/>
-          <w:bCs/>
-          <w:i w:val="false"/>
-          <w:iCs w:val="false"/>
-          <w:color w:val="000000"/>
-          <w:sz w:val="24"/>
-          <w:szCs w:val="24"/>
-        </w:rPr>
-        <w:t xml:space="preserve">M9</w:t>
-      </w:r>
-      <w:r>
-        <w:rPr>
-          <w:rFonts w:ascii="Times New Roman" w:eastAsia="Times New Roman" w:hAnsi="Times New Roman"/>
-          <w:b w:val="false"/>
-          <w:bCs w:val="false"/>
-          <w:i w:val="false"/>
-          <w:iCs w:val="false"/>
-          <w:color w:val="000000"/>
-          <w:sz w:val="24"/>
-          <w:szCs w:val="24"/>
-        </w:rPr>
-        <w:t xml:space="preserve">, la base documentaire est honorable mais orientée développeur ; la procédure de sauvegarde/restauration (pg_dump, test de restauration) et le guide administrateur restent à rédiger avant l'exploitation, sans bloquer la phase de développement.</w:t>
+        <w:t xml:space="preserve">, la base documentaire est honorable mais orientée développeur ; la procédure de sauvegarde/restauration (pg_dump, test de restauration) et le guide administrateur restent à rédiger avant l'exploitation — leur rédaction s'insère naturellement dans la préparation de la mise en production et ne bloque pas la phase de développement. Les quatre points reportés partagent la même logique : leurs prérequis logiciels sont déjà en place (réglages SMTP, dj-database-url et psycopg2, environnement prêt pour le verrouillage des dépendances), seuls les gestes d'activation restent à accomplir au déploiement.</w:t>
       </w:r>
     </w:p>
     <w:p>
@@ -2906,7 +3571,7 @@
           <w:sz w:val="20"/>
           <w:szCs w:val="20"/>
         </w:rPr>
-        <w:t xml:space="preserve">Tableau 2 — Comparaison des vérifications objectives</w:t>
+        <w:t xml:space="preserve">Tableau 3 — Comparaison des vérifications objectives</w:t>
       </w:r>
     </w:p>
     <w:tbl>
@@ -3955,7 +4620,59 @@
           <w:sz w:val="24"/>
           <w:szCs w:val="24"/>
         </w:rPr>
-        <w:t xml:space="preserve"> : les trois points critiques restants sont corrigés conformément aux recommandations de l'audit initial, avec des mécanismes complets plutôt que des réponses de surface (journalisation du consentement, clé de hachage tournante, réglages commentés), et la couverture de tests s'est accrue de trente-deux cas sans régression. La réduction du périmètre opérée par le client — C1, C2 sortis du référentiel révisé, mineures ignorées — est appliquée telle quelle dans ce rapport : le score de couverture du plan ressort à 85 %, et aucun des six points corrigés ne présente de réserve bloquante.</w:t>
+        <w:t xml:space="preserve"> : les trois points critiques restants sont corrigés conformément aux recommandations de l'audit initial, avec des mécanismes complets plutôt que des réponses de surface (journalisation du consentement, clé de hachage tournante, réglages commentés), et la couverture de tests s'est accrue de trente-deux cas sans régression. Les règles de comptage actées par le client — C1 et C2 transférés à la plateforme sig-web-platform, M1 et M2 assumés comme choix produit, mineures ignorées — sont appliquées telles quelles dans ce rapport : le </w:t>
+      </w:r>
+      <w:r>
+        <w:rPr>
+          <w:rFonts w:ascii="Times New Roman" w:eastAsia="Times New Roman" w:hAnsi="Times New Roman"/>
+          <w:b/>
+          <w:bCs/>
+          <w:i w:val="false"/>
+          <w:iCs w:val="false"/>
+          <w:color w:val="000000"/>
+          <w:sz w:val="24"/>
+          <w:szCs w:val="24"/>
+        </w:rPr>
+        <w:t xml:space="preserve">taux de réalisation du périmètre actif ressort à 95 %</w:t>
+      </w:r>
+      <w:r>
+        <w:rPr>
+          <w:rFonts w:ascii="Times New Roman" w:eastAsia="Times New Roman" w:hAnsi="Times New Roman"/>
+          <w:b w:val="false"/>
+          <w:bCs w:val="false"/>
+          <w:i w:val="false"/>
+          <w:iCs w:val="false"/>
+          <w:color w:val="000000"/>
+          <w:sz w:val="24"/>
+          <w:szCs w:val="24"/>
+        </w:rPr>
+        <w:t xml:space="preserve"> (points corrigés et reportés actés, partiels à 0,5), </w:t>
+      </w:r>
+      <w:r>
+        <w:rPr>
+          <w:rFonts w:ascii="Times New Roman" w:eastAsia="Times New Roman" w:hAnsi="Times New Roman"/>
+          <w:b/>
+          <w:bCs/>
+          <w:i w:val="false"/>
+          <w:iCs w:val="false"/>
+          <w:color w:val="000000"/>
+          <w:sz w:val="24"/>
+          <w:szCs w:val="24"/>
+        </w:rPr>
+        <w:t xml:space="preserve">sans aucun point ouvert</w:t>
+      </w:r>
+      <w:r>
+        <w:rPr>
+          <w:rFonts w:ascii="Times New Roman" w:eastAsia="Times New Roman" w:hAnsi="Times New Roman"/>
+          <w:b w:val="false"/>
+          <w:bCs w:val="false"/>
+          <w:i w:val="false"/>
+          <w:iCs w:val="false"/>
+          <w:color w:val="000000"/>
+          <w:sz w:val="24"/>
+          <w:szCs w:val="24"/>
+        </w:rPr>
+        <w:t xml:space="preserve">, et aucun des six points corrigés ne présente de réserve bloquante.</w:t>
       </w:r>
     </w:p>
     <w:p>
@@ -3999,31 +4716,7 @@
           <w:sz w:val="24"/>
           <w:szCs w:val="24"/>
         </w:rPr>
-        <w:t xml:space="preserve">Fermer M2 — décommenter la route legal/ dans pages/urls.py et ajouter le lien dans le footer (obligation légale éditoriale, cinq minutes) ;</w:t>
-      </w:r>
-    </w:p>
-    <w:p>
-      <w:pPr>
-        <w:pStyle w:val="ListParagraph"/>
-        <w:numPr>
-          <w:ilvl w:val="0"/>
-          <w:numId w:val="1"/>
-        </w:numPr>
-        <w:spacing w:after="90" w:line="312"/>
-        <w:jc w:val="left"/>
-      </w:pPr>
-      <w:r>
-        <w:rPr>
-          <w:rFonts w:ascii="Times New Roman" w:eastAsia="Times New Roman" w:hAnsi="Times New Roman"/>
-          <w:b w:val="false"/>
-          <w:bCs w:val="false"/>
-          <w:i w:val="false"/>
-          <w:iCs w:val="false"/>
-          <w:color w:val="000000"/>
-          <w:sz w:val="24"/>
-          <w:szCs w:val="24"/>
-        </w:rPr>
-        <w:t xml:space="preserve">trancher M1 — soit assumer l'accès alternatif à la plateforme (CTA d'inscription + page Démo), soit ajouter le bouton « Se connecter » dans le header ;</w:t>
+        <w:t xml:space="preserve">Compléter M9 — rédiger le guide administrateur et la procédure de sauvegarde/restauration (pg_dump, test de restauration) ;</w:t>
       </w:r>
     </w:p>
     <w:p>

</xml_diff>